<commit_message>
Improve docs and add math description to conversion
Also verify accuracy in test program and adds Excel check as well for next prompt
</commit_message>
<xml_diff>
--- a/PySupport/AdjustedNasdaq/docs/Prompt_CPI_Monthly_to_daily.docx
+++ b/PySupport/AdjustedNasdaq/docs/Prompt_CPI_Monthly_to_daily.docx
@@ -7,13 +7,13 @@
         <w:pStyle w:val="Title"/>
         <w:spacing w:after="0"/>
         <w:rPr>
-          <w:sz w:val="52"/>
+          <w:sz w:val="50"/>
           <w:szCs w:val="52"/>
         </w:rPr>
       </w:pPr>
       <w:r>
         <w:rPr>
-          <w:sz w:val="52"/>
+          <w:sz w:val="50"/>
           <w:szCs w:val="52"/>
         </w:rPr>
         <w:t>Convert CPI Monthly Rates to Daily Rates</w:t>
@@ -23,27 +23,27 @@
       <w:pPr>
         <w:spacing w:after="0" w:line="240" w:lineRule="auto"/>
         <w:rPr>
-          <w:sz w:val="22"/>
+          <w:sz w:val="21"/>
           <w:szCs w:val="22"/>
         </w:rPr>
       </w:pPr>
       <w:r>
         <w:rPr>
-          <w:sz w:val="22"/>
+          <w:sz w:val="21"/>
           <w:szCs w:val="22"/>
         </w:rPr>
         <w:t xml:space="preserve">You will create a </w:t>
       </w:r>
       <w:r>
         <w:rPr>
-          <w:sz w:val="22"/>
+          <w:sz w:val="21"/>
           <w:szCs w:val="22"/>
         </w:rPr>
         <w:t xml:space="preserve">Python </w:t>
       </w:r>
       <w:r>
         <w:rPr>
-          <w:sz w:val="22"/>
+          <w:sz w:val="21"/>
           <w:szCs w:val="22"/>
         </w:rPr>
         <w:t xml:space="preserve">module </w:t>
@@ -52,14 +52,14 @@
         <w:rPr>
           <w:b/>
           <w:bCs/>
-          <w:sz w:val="22"/>
+          <w:sz w:val="21"/>
           <w:szCs w:val="22"/>
         </w:rPr>
         <w:t>convert_rates.py</w:t>
       </w:r>
       <w:r>
         <w:rPr>
-          <w:sz w:val="22"/>
+          <w:sz w:val="21"/>
           <w:szCs w:val="22"/>
         </w:rPr>
         <w:t xml:space="preserve"> containing a public method </w:t>
@@ -68,63 +68,63 @@
         <w:rPr>
           <w:b/>
           <w:bCs/>
-          <w:sz w:val="22"/>
+          <w:sz w:val="21"/>
           <w:szCs w:val="22"/>
         </w:rPr>
         <w:t>monthly_to_daily</w:t>
       </w:r>
       <w:r>
         <w:rPr>
-          <w:sz w:val="22"/>
+          <w:sz w:val="21"/>
           <w:szCs w:val="22"/>
         </w:rPr>
         <w:t xml:space="preserve"> that </w:t>
       </w:r>
       <w:r>
         <w:rPr>
-          <w:sz w:val="22"/>
+          <w:sz w:val="21"/>
           <w:szCs w:val="22"/>
         </w:rPr>
         <w:t>accepts</w:t>
       </w:r>
       <w:r>
         <w:rPr>
-          <w:sz w:val="22"/>
+          <w:sz w:val="21"/>
           <w:szCs w:val="22"/>
         </w:rPr>
         <w:t xml:space="preserve"> a monthly CPI rate function parameter and </w:t>
       </w:r>
       <w:r>
         <w:rPr>
-          <w:sz w:val="22"/>
+          <w:sz w:val="21"/>
           <w:szCs w:val="22"/>
         </w:rPr>
         <w:t xml:space="preserve">the number of </w:t>
       </w:r>
       <w:r>
         <w:rPr>
-          <w:sz w:val="22"/>
+          <w:sz w:val="21"/>
           <w:szCs w:val="22"/>
         </w:rPr>
         <w:t>days</w:t>
       </w:r>
       <w:r>
         <w:rPr>
-          <w:sz w:val="22"/>
+          <w:sz w:val="21"/>
           <w:szCs w:val="22"/>
         </w:rPr>
         <w:t xml:space="preserve"> in the month, and </w:t>
       </w:r>
       <w:r>
         <w:rPr>
-          <w:sz w:val="22"/>
+          <w:sz w:val="21"/>
           <w:szCs w:val="22"/>
         </w:rPr>
         <w:t>returns an estimated</w:t>
       </w:r>
       <w:r>
         <w:rPr>
-          <w:sz w:val="22"/>
+          <w:sz w:val="21"/>
           <w:szCs w:val="22"/>
         </w:rPr>
         <w:t xml:space="preserve"> daily rate value calculated as described in the </w:t>
@@ -133,21 +133,21 @@
         <w:rPr>
           <w:i/>
           <w:iCs/>
-          <w:sz w:val="22"/>
+          <w:sz w:val="21"/>
           <w:szCs w:val="22"/>
         </w:rPr>
         <w:t>Rate Estimation</w:t>
       </w:r>
       <w:r>
         <w:rPr>
-          <w:sz w:val="22"/>
+          <w:sz w:val="21"/>
           <w:szCs w:val="22"/>
         </w:rPr>
         <w:t xml:space="preserve"> section below.</w:t>
       </w:r>
       <w:r>
         <w:rPr>
-          <w:sz w:val="22"/>
+          <w:sz w:val="21"/>
           <w:szCs w:val="22"/>
         </w:rPr>
         <w:t xml:space="preserve"> The function signature is:</w:t>
@@ -157,7 +157,7 @@
       <w:pPr>
         <w:spacing w:after="0" w:line="240" w:lineRule="auto"/>
         <w:rPr>
-          <w:sz w:val="22"/>
+          <w:sz w:val="21"/>
           <w:szCs w:val="22"/>
         </w:rPr>
       </w:pPr>
@@ -172,14 +172,14 @@
         <w:spacing w:after="0" w:line="240" w:lineRule="auto"/>
         <w:rPr>
           <w:rFonts w:ascii="Lucida Console" w:hAnsi="Lucida Console"/>
-          <w:sz w:val="18"/>
+          <w:sz w:val="17"/>
           <w:szCs w:val="20"/>
         </w:rPr>
       </w:pPr>
       <w:r>
         <w:rPr>
           <w:rFonts w:ascii="Lucida Console" w:hAnsi="Lucida Console"/>
-          <w:sz w:val="18"/>
+          <w:sz w:val="17"/>
           <w:szCs w:val="20"/>
         </w:rPr>
         <w:t>def monthly</w:t>
@@ -187,17 +187,33 @@
       <w:r>
         <w:rPr>
           <w:rFonts w:ascii="Lucida Console" w:hAnsi="Lucida Console"/>
-          <w:sz w:val="18"/>
+          <w:sz w:val="17"/>
           <w:szCs w:val="20"/>
         </w:rPr>
-        <w:t>_to_daily(monthly_rate: float, day_in_month: int) -&gt; float:</w:t>
+        <w:t>_to_daily(monthly_rate: float, day</w:t>
+      </w:r>
+      <w:r>
+        <w:rPr>
+          <w:rFonts w:ascii="Lucida Console" w:hAnsi="Lucida Console"/>
+          <w:sz w:val="17"/>
+          <w:szCs w:val="20"/>
+        </w:rPr>
+        <w:t>s</w:t>
+      </w:r>
+      <w:r>
+        <w:rPr>
+          <w:rFonts w:ascii="Lucida Console" w:hAnsi="Lucida Console"/>
+          <w:sz w:val="17"/>
+          <w:szCs w:val="20"/>
+        </w:rPr>
+        <w:t>_in_month: int) -&gt; float:</w:t>
       </w:r>
     </w:p>
     <w:p>
       <w:pPr>
         <w:spacing w:after="0" w:line="240" w:lineRule="auto"/>
         <w:rPr>
-          <w:sz w:val="22"/>
+          <w:sz w:val="21"/>
           <w:szCs w:val="22"/>
         </w:rPr>
       </w:pPr>
@@ -206,13 +222,13 @@
       <w:pPr>
         <w:spacing w:after="0" w:line="240" w:lineRule="auto"/>
         <w:rPr>
-          <w:sz w:val="22"/>
+          <w:sz w:val="21"/>
           <w:szCs w:val="22"/>
         </w:rPr>
       </w:pPr>
       <w:r>
         <w:rPr>
-          <w:sz w:val="22"/>
+          <w:sz w:val="21"/>
           <w:szCs w:val="22"/>
         </w:rPr>
         <w:t xml:space="preserve">where </w:t>
@@ -220,42 +236,42 @@
       <w:r>
         <w:rPr>
           <w:rFonts w:ascii="Lucida Console" w:hAnsi="Lucida Console"/>
-          <w:sz w:val="18"/>
+          <w:sz w:val="17"/>
           <w:szCs w:val="20"/>
         </w:rPr>
         <w:t>monthly_rate</w:t>
       </w:r>
       <w:r>
         <w:rPr>
-          <w:sz w:val="22"/>
+          <w:sz w:val="21"/>
           <w:szCs w:val="22"/>
         </w:rPr>
         <w:t xml:space="preserve"> is a positive value greater than zero and the return value</w:t>
       </w:r>
       <w:r>
         <w:rPr>
-          <w:sz w:val="22"/>
+          <w:sz w:val="21"/>
           <w:szCs w:val="22"/>
         </w:rPr>
         <w:t>, the daily rate as computed below,</w:t>
       </w:r>
       <w:r>
         <w:rPr>
-          <w:sz w:val="22"/>
+          <w:sz w:val="21"/>
           <w:szCs w:val="22"/>
         </w:rPr>
         <w:t xml:space="preserve"> is </w:t>
       </w:r>
       <w:r>
         <w:rPr>
-          <w:sz w:val="22"/>
-          <w:szCs w:val="22"/>
-        </w:rPr>
-        <w:t>is provided if there is no error</w:t>
-      </w:r>
-      <w:r>
-        <w:rPr>
-          <w:sz w:val="22"/>
+          <w:sz w:val="21"/>
+          <w:szCs w:val="22"/>
+        </w:rPr>
+        <w:t>provided if there is no error</w:t>
+      </w:r>
+      <w:r>
+        <w:rPr>
+          <w:sz w:val="21"/>
           <w:szCs w:val="22"/>
         </w:rPr>
         <w:t xml:space="preserve">. The </w:t>
@@ -263,7 +279,7 @@
       <w:r>
         <w:rPr>
           <w:rFonts w:ascii="Lucida Console" w:hAnsi="Lucida Console"/>
-          <w:sz w:val="18"/>
+          <w:sz w:val="17"/>
           <w:szCs w:val="20"/>
         </w:rPr>
         <w:t>days_in_</w:t>
@@ -271,49 +287,49 @@
       <w:r>
         <w:rPr>
           <w:rFonts w:ascii="Lucida Console" w:hAnsi="Lucida Console"/>
-          <w:sz w:val="18"/>
+          <w:sz w:val="17"/>
           <w:szCs w:val="20"/>
         </w:rPr>
         <w:t>month</w:t>
       </w:r>
       <w:r>
         <w:rPr>
-          <w:sz w:val="22"/>
+          <w:sz w:val="21"/>
           <w:szCs w:val="22"/>
         </w:rPr>
         <w:t xml:space="preserve"> parameter</w:t>
       </w:r>
       <w:r>
         <w:rPr>
-          <w:sz w:val="22"/>
+          <w:sz w:val="21"/>
           <w:szCs w:val="22"/>
         </w:rPr>
         <w:t xml:space="preserve"> must be between </w:t>
       </w:r>
       <w:r>
         <w:rPr>
-          <w:sz w:val="22"/>
+          <w:sz w:val="21"/>
           <w:szCs w:val="22"/>
         </w:rPr>
         <w:t>28</w:t>
       </w:r>
       <w:r>
         <w:rPr>
-          <w:sz w:val="22"/>
+          <w:sz w:val="21"/>
           <w:szCs w:val="22"/>
         </w:rPr>
         <w:t xml:space="preserve"> and 31.</w:t>
       </w:r>
       <w:r>
         <w:rPr>
-          <w:sz w:val="22"/>
+          <w:sz w:val="21"/>
           <w:szCs w:val="22"/>
         </w:rPr>
         <w:t xml:space="preserve"> The return value</w:t>
       </w:r>
       <w:r>
         <w:rPr>
-          <w:sz w:val="22"/>
+          <w:sz w:val="21"/>
           <w:szCs w:val="22"/>
         </w:rPr>
         <w:t xml:space="preserve"> will be less than the </w:t>
@@ -321,21 +337,21 @@
       <w:r>
         <w:rPr>
           <w:rFonts w:ascii="Lucida Console" w:hAnsi="Lucida Console"/>
-          <w:sz w:val="18"/>
+          <w:sz w:val="17"/>
           <w:szCs w:val="20"/>
         </w:rPr>
         <w:t>monthly_rate</w:t>
       </w:r>
       <w:r>
         <w:rPr>
-          <w:sz w:val="22"/>
+          <w:sz w:val="21"/>
           <w:szCs w:val="22"/>
         </w:rPr>
         <w:t xml:space="preserve"> parameter.</w:t>
       </w:r>
       <w:r>
         <w:rPr>
-          <w:sz w:val="22"/>
+          <w:sz w:val="21"/>
           <w:szCs w:val="22"/>
         </w:rPr>
         <w:t xml:space="preserve"> The parameters should be validated, as well as the return value being less than or equal to the </w:t>
@@ -343,21 +359,21 @@
       <w:r>
         <w:rPr>
           <w:rFonts w:ascii="Lucida Console" w:hAnsi="Lucida Console"/>
-          <w:sz w:val="18"/>
+          <w:sz w:val="17"/>
           <w:szCs w:val="20"/>
         </w:rPr>
         <w:t>monthly_rate</w:t>
       </w:r>
       <w:r>
         <w:rPr>
-          <w:sz w:val="22"/>
+          <w:sz w:val="21"/>
           <w:szCs w:val="22"/>
         </w:rPr>
         <w:t xml:space="preserve"> parameter.</w:t>
       </w:r>
       <w:r>
         <w:rPr>
-          <w:sz w:val="22"/>
+          <w:sz w:val="21"/>
           <w:szCs w:val="22"/>
         </w:rPr>
         <w:t xml:space="preserve"> Errors are reported by </w:t>
@@ -365,14 +381,14 @@
       <w:r>
         <w:rPr>
           <w:rFonts w:ascii="Lucida Console" w:hAnsi="Lucida Console"/>
-          <w:sz w:val="18"/>
+          <w:sz w:val="17"/>
           <w:szCs w:val="20"/>
         </w:rPr>
         <w:t>ValueError</w:t>
       </w:r>
       <w:r>
         <w:rPr>
-          <w:sz w:val="22"/>
+          <w:sz w:val="21"/>
           <w:szCs w:val="22"/>
         </w:rPr>
         <w:t xml:space="preserve"> Python exceptions.</w:t>
@@ -383,13 +399,13 @@
         <w:pStyle w:val="Heading1"/>
         <w:spacing w:after="0" w:line="240" w:lineRule="auto"/>
         <w:rPr>
-          <w:sz w:val="37"/>
+          <w:sz w:val="36"/>
           <w:szCs w:val="37"/>
         </w:rPr>
       </w:pPr>
       <w:r>
         <w:rPr>
-          <w:sz w:val="37"/>
+          <w:sz w:val="36"/>
           <w:szCs w:val="37"/>
         </w:rPr>
         <w:t>Rate Estimation</w:t>
@@ -399,34 +415,34 @@
       <w:pPr>
         <w:spacing w:after="0" w:line="240" w:lineRule="auto"/>
         <w:rPr>
-          <w:sz w:val="22"/>
+          <w:sz w:val="21"/>
           <w:szCs w:val="22"/>
         </w:rPr>
       </w:pPr>
       <w:r>
         <w:rPr>
-          <w:sz w:val="22"/>
+          <w:sz w:val="21"/>
           <w:szCs w:val="22"/>
         </w:rPr>
         <w:t>Note the monthly interest</w:t>
       </w:r>
       <w:r>
         <w:rPr>
-          <w:sz w:val="22"/>
+          <w:sz w:val="21"/>
           <w:szCs w:val="22"/>
         </w:rPr>
         <w:t xml:space="preserve"> rate</w:t>
       </w:r>
       <w:r>
         <w:rPr>
-          <w:sz w:val="22"/>
+          <w:sz w:val="21"/>
           <w:szCs w:val="22"/>
         </w:rPr>
         <w:t xml:space="preserve"> verses the daily interest</w:t>
       </w:r>
       <w:r>
         <w:rPr>
-          <w:sz w:val="22"/>
+          <w:sz w:val="21"/>
           <w:szCs w:val="22"/>
         </w:rPr>
         <w:t xml:space="preserve"> must result in identical value at the end of an </w:t>
@@ -435,28 +451,28 @@
         <w:rPr>
           <w:b/>
           <w:bCs/>
-          <w:sz w:val="22"/>
+          <w:sz w:val="21"/>
           <w:szCs w:val="22"/>
         </w:rPr>
         <w:t>N</w:t>
       </w:r>
       <w:r>
         <w:rPr>
-          <w:sz w:val="22"/>
+          <w:sz w:val="21"/>
           <w:szCs w:val="22"/>
         </w:rPr>
         <w:t xml:space="preserve"> Day</w:t>
       </w:r>
       <w:r>
         <w:rPr>
-          <w:sz w:val="22"/>
+          <w:sz w:val="21"/>
           <w:szCs w:val="22"/>
         </w:rPr>
         <w:t xml:space="preserve"> month</w:t>
       </w:r>
       <w:r>
         <w:rPr>
-          <w:sz w:val="22"/>
+          <w:sz w:val="21"/>
           <w:szCs w:val="22"/>
         </w:rPr>
         <w:t xml:space="preserve">: </w:t>
@@ -465,21 +481,21 @@
         <w:rPr>
           <w:b/>
           <w:bCs/>
-          <w:sz w:val="22"/>
+          <w:sz w:val="21"/>
           <w:szCs w:val="22"/>
         </w:rPr>
         <w:t>(1 + R) = (1 + r) ^ N</w:t>
       </w:r>
       <w:r>
         <w:rPr>
-          <w:sz w:val="22"/>
+          <w:sz w:val="21"/>
           <w:szCs w:val="22"/>
         </w:rPr>
         <w:t>,</w:t>
       </w:r>
       <w:r>
         <w:rPr>
-          <w:sz w:val="22"/>
+          <w:sz w:val="21"/>
           <w:szCs w:val="22"/>
         </w:rPr>
         <w:t xml:space="preserve"> 27 &lt; </w:t>
@@ -488,14 +504,14 @@
         <w:rPr>
           <w:b/>
           <w:bCs/>
-          <w:sz w:val="22"/>
+          <w:sz w:val="21"/>
           <w:szCs w:val="22"/>
         </w:rPr>
         <w:t>N</w:t>
       </w:r>
       <w:r>
         <w:rPr>
-          <w:sz w:val="22"/>
+          <w:sz w:val="21"/>
           <w:szCs w:val="22"/>
         </w:rPr>
         <w:t xml:space="preserve"> &lt; 32.</w:t>
@@ -505,7 +521,7 @@
       <w:pPr>
         <w:spacing w:after="0" w:line="240" w:lineRule="auto"/>
         <w:rPr>
-          <w:sz w:val="22"/>
+          <w:sz w:val="21"/>
           <w:szCs w:val="22"/>
         </w:rPr>
       </w:pPr>
@@ -514,13 +530,13 @@
       <w:pPr>
         <w:spacing w:after="0" w:line="240" w:lineRule="auto"/>
         <w:rPr>
-          <w:sz w:val="22"/>
+          <w:sz w:val="21"/>
           <w:szCs w:val="22"/>
         </w:rPr>
       </w:pPr>
       <w:r>
         <w:rPr>
-          <w:sz w:val="22"/>
+          <w:sz w:val="21"/>
           <w:szCs w:val="22"/>
         </w:rPr>
         <w:t xml:space="preserve">Where </w:t>
@@ -529,14 +545,14 @@
         <w:rPr>
           <w:b/>
           <w:bCs/>
-          <w:sz w:val="22"/>
+          <w:sz w:val="21"/>
           <w:szCs w:val="22"/>
         </w:rPr>
         <w:t>R</w:t>
       </w:r>
       <w:r>
         <w:rPr>
-          <w:sz w:val="22"/>
+          <w:sz w:val="21"/>
           <w:szCs w:val="22"/>
         </w:rPr>
         <w:t xml:space="preserve"> is a single monthly CPI inflation rate; </w:t>
@@ -545,14 +561,14 @@
         <w:rPr>
           <w:b/>
           <w:bCs/>
-          <w:sz w:val="22"/>
+          <w:sz w:val="21"/>
           <w:szCs w:val="22"/>
         </w:rPr>
         <w:t>r</w:t>
       </w:r>
       <w:r>
         <w:rPr>
-          <w:sz w:val="22"/>
+          <w:sz w:val="21"/>
           <w:szCs w:val="22"/>
         </w:rPr>
         <w:t xml:space="preserve"> is the daily rate, we would apply (</w:t>
@@ -561,14 +577,14 @@
         <w:rPr>
           <w:b/>
           <w:bCs/>
-          <w:sz w:val="22"/>
+          <w:sz w:val="21"/>
           <w:szCs w:val="22"/>
         </w:rPr>
         <w:t>r</w:t>
       </w:r>
       <w:r>
         <w:rPr>
-          <w:sz w:val="22"/>
+          <w:sz w:val="21"/>
           <w:szCs w:val="22"/>
         </w:rPr>
         <w:t xml:space="preserve"> &lt; </w:t>
@@ -577,14 +593,14 @@
         <w:rPr>
           <w:b/>
           <w:bCs/>
-          <w:sz w:val="22"/>
+          <w:sz w:val="21"/>
           <w:szCs w:val="22"/>
         </w:rPr>
         <w:t>R</w:t>
       </w:r>
       <w:r>
         <w:rPr>
-          <w:sz w:val="22"/>
+          <w:sz w:val="21"/>
           <w:szCs w:val="22"/>
         </w:rPr>
         <w:t xml:space="preserve">). Finally, </w:t>
@@ -593,28 +609,28 @@
         <w:rPr>
           <w:b/>
           <w:bCs/>
-          <w:sz w:val="22"/>
+          <w:sz w:val="21"/>
           <w:szCs w:val="22"/>
         </w:rPr>
         <w:t>N</w:t>
       </w:r>
       <w:r>
         <w:rPr>
-          <w:sz w:val="22"/>
+          <w:sz w:val="21"/>
           <w:szCs w:val="22"/>
         </w:rPr>
         <w:t xml:space="preserve"> represents the number of days in the month that the daily rate is </w:t>
       </w:r>
       <w:r>
         <w:rPr>
-          <w:sz w:val="22"/>
+          <w:sz w:val="21"/>
           <w:szCs w:val="22"/>
         </w:rPr>
         <w:t>applied</w:t>
       </w:r>
       <w:r>
         <w:rPr>
-          <w:sz w:val="22"/>
+          <w:sz w:val="21"/>
           <w:szCs w:val="22"/>
         </w:rPr>
         <w:t>. We then have:</w:t>
@@ -629,13 +645,13 @@
         </w:numPr>
         <w:spacing w:after="0" w:line="240" w:lineRule="auto"/>
         <w:rPr>
-          <w:sz w:val="22"/>
+          <w:sz w:val="21"/>
           <w:szCs w:val="22"/>
         </w:rPr>
       </w:pPr>
       <w:r>
         <w:rPr>
-          <w:sz w:val="22"/>
+          <w:sz w:val="21"/>
           <w:szCs w:val="22"/>
         </w:rPr>
         <w:t xml:space="preserve">Daily CPI estimate </w:t>
@@ -646,7 +662,7 @@
           <w:bCs/>
           <w:i/>
           <w:iCs/>
-          <w:sz w:val="22"/>
+          <w:sz w:val="21"/>
           <w:szCs w:val="22"/>
         </w:rPr>
         <w:t xml:space="preserve">r = exp (log (1 + R)/N) </w:t>
@@ -657,7 +673,7 @@
           <w:bCs/>
           <w:i/>
           <w:iCs/>
-          <w:sz w:val="22"/>
+          <w:sz w:val="21"/>
           <w:szCs w:val="22"/>
         </w:rPr>
         <w:t>–</w:t>
@@ -668,14 +684,14 @@
           <w:bCs/>
           <w:i/>
           <w:iCs/>
-          <w:sz w:val="22"/>
+          <w:sz w:val="21"/>
           <w:szCs w:val="22"/>
         </w:rPr>
         <w:t xml:space="preserve"> 1</w:t>
       </w:r>
       <w:r>
         <w:rPr>
-          <w:sz w:val="22"/>
+          <w:sz w:val="21"/>
           <w:szCs w:val="22"/>
         </w:rPr>
         <w:t>.</w:t>
@@ -685,20 +701,20 @@
       <w:pPr>
         <w:spacing w:after="0" w:line="240" w:lineRule="auto"/>
         <w:rPr>
-          <w:sz w:val="22"/>
+          <w:sz w:val="21"/>
           <w:szCs w:val="22"/>
         </w:rPr>
       </w:pPr>
       <w:r>
         <w:rPr>
-          <w:sz w:val="22"/>
+          <w:sz w:val="21"/>
           <w:szCs w:val="22"/>
         </w:rPr>
         <w:t xml:space="preserve">Note that r is the return value of the function. </w:t>
       </w:r>
       <w:r>
         <w:rPr>
-          <w:sz w:val="22"/>
+          <w:sz w:val="21"/>
           <w:szCs w:val="22"/>
         </w:rPr>
         <w:t>Here is a table showing a numerical example from Excel:</w:t>
@@ -711,8 +727,8 @@
       </w:tblPr>
       <w:tblGrid>
         <w:gridCol w:w="1122"/>
-        <w:gridCol w:w="616"/>
-        <w:gridCol w:w="1018"/>
+        <w:gridCol w:w="596"/>
+        <w:gridCol w:w="978"/>
         <w:gridCol w:w="1500"/>
         <w:gridCol w:w="1160"/>
         <w:gridCol w:w="222"/>
@@ -741,7 +757,7 @@
               <w:rPr>
                 <w:rFonts w:ascii="Times New Roman" w:eastAsia="Times New Roman" w:hAnsi="Times New Roman" w:cs="Times New Roman"/>
                 <w:kern w:val="0"/>
-                <w:sz w:val="22"/>
+                <w:sz w:val="21"/>
                 <w:szCs w:val="22"/>
                 <w14:ligatures w14:val="none"/>
               </w:rPr>
@@ -767,7 +783,7 @@
               <w:rPr>
                 <w:rFonts w:ascii="Times New Roman" w:eastAsia="Times New Roman" w:hAnsi="Times New Roman" w:cs="Times New Roman"/>
                 <w:kern w:val="0"/>
-                <w:sz w:val="18"/>
+                <w:sz w:val="17"/>
                 <w:szCs w:val="20"/>
                 <w14:ligatures w14:val="none"/>
               </w:rPr>
@@ -793,7 +809,7 @@
               <w:rPr>
                 <w:rFonts w:ascii="Times New Roman" w:eastAsia="Times New Roman" w:hAnsi="Times New Roman" w:cs="Times New Roman"/>
                 <w:kern w:val="0"/>
-                <w:sz w:val="18"/>
+                <w:sz w:val="17"/>
                 <w:szCs w:val="20"/>
                 <w14:ligatures w14:val="none"/>
               </w:rPr>
@@ -822,7 +838,7 @@
                 <w:bCs/>
                 <w:color w:val="000000"/>
                 <w:kern w:val="0"/>
-                <w:sz w:val="20"/>
+                <w:sz w:val="19"/>
                 <w:szCs w:val="22"/>
                 <w14:ligatures w14:val="none"/>
               </w:rPr>
@@ -852,7 +868,7 @@
                 <w:bCs/>
                 <w:color w:val="000000"/>
                 <w:kern w:val="0"/>
-                <w:sz w:val="20"/>
+                <w:sz w:val="19"/>
                 <w:szCs w:val="22"/>
                 <w14:ligatures w14:val="none"/>
               </w:rPr>
@@ -878,7 +894,7 @@
               <w:rPr>
                 <w:rFonts w:ascii="Times New Roman" w:eastAsia="Times New Roman" w:hAnsi="Times New Roman" w:cs="Times New Roman"/>
                 <w:kern w:val="0"/>
-                <w:sz w:val="18"/>
+                <w:sz w:val="17"/>
                 <w:szCs w:val="20"/>
                 <w14:ligatures w14:val="none"/>
               </w:rPr>
@@ -904,7 +920,7 @@
               <w:rPr>
                 <w:rFonts w:ascii="Times New Roman" w:eastAsia="Times New Roman" w:hAnsi="Times New Roman" w:cs="Times New Roman"/>
                 <w:kern w:val="0"/>
-                <w:sz w:val="18"/>
+                <w:sz w:val="17"/>
                 <w:szCs w:val="20"/>
                 <w14:ligatures w14:val="none"/>
               </w:rPr>
@@ -939,7 +955,7 @@
                 <w:bCs/>
                 <w:color w:val="000000"/>
                 <w:kern w:val="0"/>
-                <w:sz w:val="20"/>
+                <w:sz w:val="19"/>
                 <w:szCs w:val="22"/>
                 <w14:ligatures w14:val="none"/>
               </w:rPr>
@@ -951,7 +967,7 @@
                 <w:bCs/>
                 <w:color w:val="000000"/>
                 <w:kern w:val="0"/>
-                <w:sz w:val="20"/>
+                <w:sz w:val="19"/>
                 <w:szCs w:val="22"/>
                 <w14:ligatures w14:val="none"/>
               </w:rPr>
@@ -982,7 +998,7 @@
                 <w:bCs/>
                 <w:color w:val="000000"/>
                 <w:kern w:val="0"/>
-                <w:sz w:val="20"/>
+                <w:sz w:val="19"/>
                 <w:szCs w:val="22"/>
                 <w14:ligatures w14:val="none"/>
               </w:rPr>
@@ -994,7 +1010,7 @@
                 <w:bCs/>
                 <w:color w:val="000000"/>
                 <w:kern w:val="0"/>
-                <w:sz w:val="20"/>
+                <w:sz w:val="19"/>
                 <w:szCs w:val="22"/>
                 <w14:ligatures w14:val="none"/>
               </w:rPr>
@@ -1025,7 +1041,7 @@
                 <w:bCs/>
                 <w:color w:val="000000"/>
                 <w:kern w:val="0"/>
-                <w:sz w:val="20"/>
+                <w:sz w:val="19"/>
                 <w:szCs w:val="22"/>
                 <w14:ligatures w14:val="none"/>
               </w:rPr>
@@ -1037,7 +1053,7 @@
                 <w:bCs/>
                 <w:color w:val="000000"/>
                 <w:kern w:val="0"/>
-                <w:sz w:val="20"/>
+                <w:sz w:val="19"/>
                 <w:szCs w:val="22"/>
                 <w14:ligatures w14:val="none"/>
               </w:rPr>
@@ -1068,7 +1084,7 @@
                 <w:bCs/>
                 <w:color w:val="000000"/>
                 <w:kern w:val="0"/>
-                <w:sz w:val="20"/>
+                <w:sz w:val="19"/>
                 <w:szCs w:val="22"/>
                 <w14:ligatures w14:val="none"/>
               </w:rPr>
@@ -1080,7 +1096,7 @@
                 <w:bCs/>
                 <w:color w:val="000000"/>
                 <w:kern w:val="0"/>
-                <w:sz w:val="20"/>
+                <w:sz w:val="19"/>
                 <w:szCs w:val="22"/>
                 <w14:ligatures w14:val="none"/>
               </w:rPr>
@@ -1093,7 +1109,7 @@
                 <w:bCs/>
                 <w:color w:val="000000"/>
                 <w:kern w:val="0"/>
-                <w:sz w:val="20"/>
+                <w:sz w:val="19"/>
                 <w:szCs w:val="22"/>
                 <w14:ligatures w14:val="none"/>
               </w:rPr>
@@ -1124,7 +1140,7 @@
                 <w:bCs/>
                 <w:color w:val="000000"/>
                 <w:kern w:val="0"/>
-                <w:sz w:val="20"/>
+                <w:sz w:val="19"/>
                 <w:szCs w:val="22"/>
                 <w14:ligatures w14:val="none"/>
               </w:rPr>
@@ -1136,7 +1152,7 @@
                 <w:bCs/>
                 <w:color w:val="000000"/>
                 <w:kern w:val="0"/>
-                <w:sz w:val="20"/>
+                <w:sz w:val="19"/>
                 <w:szCs w:val="22"/>
                 <w14:ligatures w14:val="none"/>
               </w:rPr>
@@ -1149,7 +1165,7 @@
                 <w:bCs/>
                 <w:color w:val="000000"/>
                 <w:kern w:val="0"/>
-                <w:sz w:val="20"/>
+                <w:sz w:val="19"/>
                 <w:szCs w:val="22"/>
                 <w14:ligatures w14:val="none"/>
               </w:rPr>
@@ -1162,7 +1178,7 @@
                 <w:bCs/>
                 <w:color w:val="000000"/>
                 <w:kern w:val="0"/>
-                <w:sz w:val="20"/>
+                <w:sz w:val="19"/>
                 <w:szCs w:val="22"/>
                 <w14:ligatures w14:val="none"/>
               </w:rPr>
@@ -1193,7 +1209,7 @@
                 <w:bCs/>
                 <w:color w:val="000000"/>
                 <w:kern w:val="0"/>
-                <w:sz w:val="20"/>
+                <w:sz w:val="19"/>
                 <w:szCs w:val="22"/>
                 <w14:ligatures w14:val="none"/>
               </w:rPr>
@@ -1223,7 +1239,7 @@
                 <w:bCs/>
                 <w:color w:val="000000"/>
                 <w:kern w:val="0"/>
-                <w:sz w:val="20"/>
+                <w:sz w:val="19"/>
                 <w:szCs w:val="22"/>
                 <w14:ligatures w14:val="none"/>
               </w:rPr>
@@ -1235,7 +1251,7 @@
                 <w:bCs/>
                 <w:color w:val="000000"/>
                 <w:kern w:val="0"/>
-                <w:sz w:val="20"/>
+                <w:sz w:val="19"/>
                 <w:szCs w:val="22"/>
                 <w14:ligatures w14:val="none"/>
               </w:rPr>
@@ -1269,7 +1285,7 @@
                 <w:rFonts w:ascii="Calibri" w:eastAsia="Times New Roman" w:hAnsi="Calibri" w:cs="Calibri"/>
                 <w:color w:val="000000"/>
                 <w:kern w:val="0"/>
-                <w:sz w:val="20"/>
+                <w:sz w:val="19"/>
                 <w:szCs w:val="22"/>
                 <w14:ligatures w14:val="none"/>
               </w:rPr>
@@ -1279,7 +1295,7 @@
                 <w:rFonts w:ascii="Calibri" w:eastAsia="Times New Roman" w:hAnsi="Calibri" w:cs="Calibri"/>
                 <w:color w:val="000000"/>
                 <w:kern w:val="0"/>
-                <w:sz w:val="20"/>
+                <w:sz w:val="19"/>
                 <w:szCs w:val="22"/>
                 <w14:ligatures w14:val="none"/>
               </w:rPr>
@@ -1308,7 +1324,7 @@
                 <w:rFonts w:ascii="Calibri" w:eastAsia="Times New Roman" w:hAnsi="Calibri" w:cs="Calibri"/>
                 <w:color w:val="000000"/>
                 <w:kern w:val="0"/>
-                <w:sz w:val="20"/>
+                <w:sz w:val="19"/>
                 <w:szCs w:val="22"/>
                 <w14:ligatures w14:val="none"/>
               </w:rPr>
@@ -1318,7 +1334,7 @@
                 <w:rFonts w:ascii="Calibri" w:eastAsia="Times New Roman" w:hAnsi="Calibri" w:cs="Calibri"/>
                 <w:color w:val="000000"/>
                 <w:kern w:val="0"/>
-                <w:sz w:val="20"/>
+                <w:sz w:val="19"/>
                 <w:szCs w:val="22"/>
                 <w14:ligatures w14:val="none"/>
               </w:rPr>
@@ -1347,7 +1363,7 @@
                 <w:rFonts w:ascii="Calibri" w:eastAsia="Times New Roman" w:hAnsi="Calibri" w:cs="Calibri"/>
                 <w:color w:val="000000"/>
                 <w:kern w:val="0"/>
-                <w:sz w:val="20"/>
+                <w:sz w:val="19"/>
                 <w:szCs w:val="22"/>
                 <w14:ligatures w14:val="none"/>
               </w:rPr>
@@ -1357,7 +1373,7 @@
                 <w:rFonts w:ascii="Calibri" w:eastAsia="Times New Roman" w:hAnsi="Calibri" w:cs="Calibri"/>
                 <w:color w:val="000000"/>
                 <w:kern w:val="0"/>
-                <w:sz w:val="20"/>
+                <w:sz w:val="19"/>
                 <w:szCs w:val="22"/>
                 <w14:ligatures w14:val="none"/>
               </w:rPr>
@@ -1386,7 +1402,7 @@
                 <w:rFonts w:ascii="Calibri" w:eastAsia="Times New Roman" w:hAnsi="Calibri" w:cs="Calibri"/>
                 <w:color w:val="000000"/>
                 <w:kern w:val="0"/>
-                <w:sz w:val="20"/>
+                <w:sz w:val="19"/>
                 <w:szCs w:val="22"/>
                 <w14:ligatures w14:val="none"/>
               </w:rPr>
@@ -1396,7 +1412,7 @@
                 <w:rFonts w:ascii="Calibri" w:eastAsia="Times New Roman" w:hAnsi="Calibri" w:cs="Calibri"/>
                 <w:color w:val="000000"/>
                 <w:kern w:val="0"/>
-                <w:sz w:val="20"/>
+                <w:sz w:val="19"/>
                 <w:szCs w:val="22"/>
                 <w14:ligatures w14:val="none"/>
               </w:rPr>
@@ -1425,7 +1441,7 @@
                 <w:rFonts w:ascii="Calibri" w:eastAsia="Times New Roman" w:hAnsi="Calibri" w:cs="Calibri"/>
                 <w:color w:val="000000"/>
                 <w:kern w:val="0"/>
-                <w:sz w:val="20"/>
+                <w:sz w:val="19"/>
                 <w:szCs w:val="22"/>
                 <w14:ligatures w14:val="none"/>
               </w:rPr>
@@ -1435,7 +1451,7 @@
                 <w:rFonts w:ascii="Calibri" w:eastAsia="Times New Roman" w:hAnsi="Calibri" w:cs="Calibri"/>
                 <w:color w:val="000000"/>
                 <w:kern w:val="0"/>
-                <w:sz w:val="20"/>
+                <w:sz w:val="19"/>
                 <w:szCs w:val="22"/>
                 <w14:ligatures w14:val="none"/>
               </w:rPr>
@@ -1464,7 +1480,7 @@
                 <w:rFonts w:ascii="Calibri" w:eastAsia="Times New Roman" w:hAnsi="Calibri" w:cs="Calibri"/>
                 <w:color w:val="000000"/>
                 <w:kern w:val="0"/>
-                <w:sz w:val="20"/>
+                <w:sz w:val="19"/>
                 <w:szCs w:val="22"/>
                 <w14:ligatures w14:val="none"/>
               </w:rPr>
@@ -1492,7 +1508,7 @@
                 <w:rFonts w:ascii="Calibri" w:eastAsia="Times New Roman" w:hAnsi="Calibri" w:cs="Calibri"/>
                 <w:color w:val="000000"/>
                 <w:kern w:val="0"/>
-                <w:sz w:val="20"/>
+                <w:sz w:val="19"/>
                 <w:szCs w:val="22"/>
                 <w14:ligatures w14:val="none"/>
               </w:rPr>
@@ -1502,7 +1518,7 @@
                 <w:rFonts w:ascii="Calibri" w:eastAsia="Times New Roman" w:hAnsi="Calibri" w:cs="Calibri"/>
                 <w:color w:val="000000"/>
                 <w:kern w:val="0"/>
-                <w:sz w:val="20"/>
+                <w:sz w:val="19"/>
                 <w:szCs w:val="22"/>
                 <w14:ligatures w14:val="none"/>
               </w:rPr>
@@ -1536,7 +1552,7 @@
                 <w:rFonts w:ascii="Calibri" w:eastAsia="Times New Roman" w:hAnsi="Calibri" w:cs="Calibri"/>
                 <w:color w:val="000000"/>
                 <w:kern w:val="0"/>
-                <w:sz w:val="20"/>
+                <w:sz w:val="19"/>
                 <w:szCs w:val="22"/>
                 <w14:ligatures w14:val="none"/>
               </w:rPr>
@@ -1546,7 +1562,7 @@
                 <w:rFonts w:ascii="Calibri" w:eastAsia="Times New Roman" w:hAnsi="Calibri" w:cs="Calibri"/>
                 <w:color w:val="000000"/>
                 <w:kern w:val="0"/>
-                <w:sz w:val="20"/>
+                <w:sz w:val="19"/>
                 <w:szCs w:val="22"/>
                 <w14:ligatures w14:val="none"/>
               </w:rPr>
@@ -1575,7 +1591,7 @@
                 <w:rFonts w:ascii="Calibri" w:eastAsia="Times New Roman" w:hAnsi="Calibri" w:cs="Calibri"/>
                 <w:color w:val="000000"/>
                 <w:kern w:val="0"/>
-                <w:sz w:val="20"/>
+                <w:sz w:val="19"/>
                 <w:szCs w:val="22"/>
                 <w14:ligatures w14:val="none"/>
               </w:rPr>
@@ -1585,7 +1601,7 @@
                 <w:rFonts w:ascii="Calibri" w:eastAsia="Times New Roman" w:hAnsi="Calibri" w:cs="Calibri"/>
                 <w:color w:val="000000"/>
                 <w:kern w:val="0"/>
-                <w:sz w:val="20"/>
+                <w:sz w:val="19"/>
                 <w:szCs w:val="22"/>
                 <w14:ligatures w14:val="none"/>
               </w:rPr>
@@ -1614,7 +1630,7 @@
                 <w:rFonts w:ascii="Calibri" w:eastAsia="Times New Roman" w:hAnsi="Calibri" w:cs="Calibri"/>
                 <w:color w:val="000000"/>
                 <w:kern w:val="0"/>
-                <w:sz w:val="20"/>
+                <w:sz w:val="19"/>
                 <w:szCs w:val="22"/>
                 <w14:ligatures w14:val="none"/>
               </w:rPr>
@@ -1624,7 +1640,7 @@
                 <w:rFonts w:ascii="Calibri" w:eastAsia="Times New Roman" w:hAnsi="Calibri" w:cs="Calibri"/>
                 <w:color w:val="000000"/>
                 <w:kern w:val="0"/>
-                <w:sz w:val="20"/>
+                <w:sz w:val="19"/>
                 <w:szCs w:val="22"/>
                 <w14:ligatures w14:val="none"/>
               </w:rPr>
@@ -1653,7 +1669,7 @@
                 <w:rFonts w:ascii="Calibri" w:eastAsia="Times New Roman" w:hAnsi="Calibri" w:cs="Calibri"/>
                 <w:color w:val="000000"/>
                 <w:kern w:val="0"/>
-                <w:sz w:val="20"/>
+                <w:sz w:val="19"/>
                 <w:szCs w:val="22"/>
                 <w14:ligatures w14:val="none"/>
               </w:rPr>
@@ -1663,7 +1679,7 @@
                 <w:rFonts w:ascii="Calibri" w:eastAsia="Times New Roman" w:hAnsi="Calibri" w:cs="Calibri"/>
                 <w:color w:val="000000"/>
                 <w:kern w:val="0"/>
-                <w:sz w:val="20"/>
+                <w:sz w:val="19"/>
                 <w:szCs w:val="22"/>
                 <w14:ligatures w14:val="none"/>
               </w:rPr>
@@ -1692,7 +1708,7 @@
                 <w:rFonts w:ascii="Calibri" w:eastAsia="Times New Roman" w:hAnsi="Calibri" w:cs="Calibri"/>
                 <w:color w:val="000000"/>
                 <w:kern w:val="0"/>
-                <w:sz w:val="20"/>
+                <w:sz w:val="19"/>
                 <w:szCs w:val="22"/>
                 <w14:ligatures w14:val="none"/>
               </w:rPr>
@@ -1702,7 +1718,7 @@
                 <w:rFonts w:ascii="Calibri" w:eastAsia="Times New Roman" w:hAnsi="Calibri" w:cs="Calibri"/>
                 <w:color w:val="000000"/>
                 <w:kern w:val="0"/>
-                <w:sz w:val="20"/>
+                <w:sz w:val="19"/>
                 <w:szCs w:val="22"/>
                 <w14:ligatures w14:val="none"/>
               </w:rPr>
@@ -1731,7 +1747,7 @@
                 <w:rFonts w:ascii="Calibri" w:eastAsia="Times New Roman" w:hAnsi="Calibri" w:cs="Calibri"/>
                 <w:color w:val="000000"/>
                 <w:kern w:val="0"/>
-                <w:sz w:val="20"/>
+                <w:sz w:val="19"/>
                 <w:szCs w:val="22"/>
                 <w14:ligatures w14:val="none"/>
               </w:rPr>
@@ -1759,7 +1775,7 @@
                 <w:rFonts w:ascii="Calibri" w:eastAsia="Times New Roman" w:hAnsi="Calibri" w:cs="Calibri"/>
                 <w:color w:val="000000"/>
                 <w:kern w:val="0"/>
-                <w:sz w:val="18"/>
+                <w:sz w:val="17"/>
                 <w:szCs w:val="20"/>
                 <w14:ligatures w14:val="none"/>
               </w:rPr>
@@ -1769,7 +1785,7 @@
                 <w:rFonts w:ascii="Calibri" w:eastAsia="Times New Roman" w:hAnsi="Calibri" w:cs="Calibri"/>
                 <w:color w:val="000000"/>
                 <w:kern w:val="0"/>
-                <w:sz w:val="18"/>
+                <w:sz w:val="17"/>
                 <w:szCs w:val="20"/>
                 <w14:ligatures w14:val="none"/>
               </w:rPr>
@@ -1803,7 +1819,7 @@
                 <w:rFonts w:ascii="Calibri" w:eastAsia="Times New Roman" w:hAnsi="Calibri" w:cs="Calibri"/>
                 <w:color w:val="000000"/>
                 <w:kern w:val="0"/>
-                <w:sz w:val="20"/>
+                <w:sz w:val="19"/>
                 <w:szCs w:val="22"/>
                 <w14:ligatures w14:val="none"/>
               </w:rPr>
@@ -1813,7 +1829,7 @@
                 <w:rFonts w:ascii="Calibri" w:eastAsia="Times New Roman" w:hAnsi="Calibri" w:cs="Calibri"/>
                 <w:color w:val="000000"/>
                 <w:kern w:val="0"/>
-                <w:sz w:val="20"/>
+                <w:sz w:val="19"/>
                 <w:szCs w:val="22"/>
                 <w14:ligatures w14:val="none"/>
               </w:rPr>
@@ -1842,7 +1858,7 @@
                 <w:rFonts w:ascii="Calibri" w:eastAsia="Times New Roman" w:hAnsi="Calibri" w:cs="Calibri"/>
                 <w:color w:val="000000"/>
                 <w:kern w:val="0"/>
-                <w:sz w:val="20"/>
+                <w:sz w:val="19"/>
                 <w:szCs w:val="22"/>
                 <w14:ligatures w14:val="none"/>
               </w:rPr>
@@ -1852,7 +1868,7 @@
                 <w:rFonts w:ascii="Calibri" w:eastAsia="Times New Roman" w:hAnsi="Calibri" w:cs="Calibri"/>
                 <w:color w:val="000000"/>
                 <w:kern w:val="0"/>
-                <w:sz w:val="20"/>
+                <w:sz w:val="19"/>
                 <w:szCs w:val="22"/>
                 <w14:ligatures w14:val="none"/>
               </w:rPr>
@@ -1881,7 +1897,7 @@
                 <w:rFonts w:ascii="Calibri" w:eastAsia="Times New Roman" w:hAnsi="Calibri" w:cs="Calibri"/>
                 <w:color w:val="000000"/>
                 <w:kern w:val="0"/>
-                <w:sz w:val="20"/>
+                <w:sz w:val="19"/>
                 <w:szCs w:val="22"/>
                 <w14:ligatures w14:val="none"/>
               </w:rPr>
@@ -1891,7 +1907,7 @@
                 <w:rFonts w:ascii="Calibri" w:eastAsia="Times New Roman" w:hAnsi="Calibri" w:cs="Calibri"/>
                 <w:color w:val="000000"/>
                 <w:kern w:val="0"/>
-                <w:sz w:val="20"/>
+                <w:sz w:val="19"/>
                 <w:szCs w:val="22"/>
                 <w14:ligatures w14:val="none"/>
               </w:rPr>
@@ -1920,7 +1936,7 @@
                 <w:rFonts w:ascii="Calibri" w:eastAsia="Times New Roman" w:hAnsi="Calibri" w:cs="Calibri"/>
                 <w:color w:val="000000"/>
                 <w:kern w:val="0"/>
-                <w:sz w:val="20"/>
+                <w:sz w:val="19"/>
                 <w:szCs w:val="22"/>
                 <w14:ligatures w14:val="none"/>
               </w:rPr>
@@ -1930,7 +1946,7 @@
                 <w:rFonts w:ascii="Calibri" w:eastAsia="Times New Roman" w:hAnsi="Calibri" w:cs="Calibri"/>
                 <w:color w:val="000000"/>
                 <w:kern w:val="0"/>
-                <w:sz w:val="20"/>
+                <w:sz w:val="19"/>
                 <w:szCs w:val="22"/>
                 <w14:ligatures w14:val="none"/>
               </w:rPr>
@@ -1959,7 +1975,7 @@
                 <w:rFonts w:ascii="Calibri" w:eastAsia="Times New Roman" w:hAnsi="Calibri" w:cs="Calibri"/>
                 <w:color w:val="000000"/>
                 <w:kern w:val="0"/>
-                <w:sz w:val="20"/>
+                <w:sz w:val="19"/>
                 <w:szCs w:val="22"/>
                 <w14:ligatures w14:val="none"/>
               </w:rPr>
@@ -1969,7 +1985,7 @@
                 <w:rFonts w:ascii="Calibri" w:eastAsia="Times New Roman" w:hAnsi="Calibri" w:cs="Calibri"/>
                 <w:color w:val="000000"/>
                 <w:kern w:val="0"/>
-                <w:sz w:val="20"/>
+                <w:sz w:val="19"/>
                 <w:szCs w:val="22"/>
                 <w14:ligatures w14:val="none"/>
               </w:rPr>
@@ -1998,7 +2014,7 @@
                 <w:rFonts w:ascii="Calibri" w:eastAsia="Times New Roman" w:hAnsi="Calibri" w:cs="Calibri"/>
                 <w:color w:val="000000"/>
                 <w:kern w:val="0"/>
-                <w:sz w:val="20"/>
+                <w:sz w:val="19"/>
                 <w:szCs w:val="22"/>
                 <w14:ligatures w14:val="none"/>
               </w:rPr>
@@ -2026,7 +2042,7 @@
                 <w:rFonts w:ascii="Calibri" w:eastAsia="Times New Roman" w:hAnsi="Calibri" w:cs="Calibri"/>
                 <w:color w:val="000000"/>
                 <w:kern w:val="0"/>
-                <w:sz w:val="20"/>
+                <w:sz w:val="19"/>
                 <w:szCs w:val="22"/>
                 <w14:ligatures w14:val="none"/>
               </w:rPr>
@@ -2036,7 +2052,7 @@
                 <w:rFonts w:ascii="Calibri" w:eastAsia="Times New Roman" w:hAnsi="Calibri" w:cs="Calibri"/>
                 <w:color w:val="000000"/>
                 <w:kern w:val="0"/>
-                <w:sz w:val="20"/>
+                <w:sz w:val="19"/>
                 <w:szCs w:val="22"/>
                 <w14:ligatures w14:val="none"/>
               </w:rPr>
@@ -2070,7 +2086,7 @@
                 <w:rFonts w:ascii="Calibri" w:eastAsia="Times New Roman" w:hAnsi="Calibri" w:cs="Calibri"/>
                 <w:color w:val="000000"/>
                 <w:kern w:val="0"/>
-                <w:sz w:val="20"/>
+                <w:sz w:val="19"/>
                 <w:szCs w:val="22"/>
                 <w14:ligatures w14:val="none"/>
               </w:rPr>
@@ -2080,7 +2096,7 @@
                 <w:rFonts w:ascii="Calibri" w:eastAsia="Times New Roman" w:hAnsi="Calibri" w:cs="Calibri"/>
                 <w:color w:val="000000"/>
                 <w:kern w:val="0"/>
-                <w:sz w:val="20"/>
+                <w:sz w:val="19"/>
                 <w:szCs w:val="22"/>
                 <w14:ligatures w14:val="none"/>
               </w:rPr>
@@ -2109,7 +2125,7 @@
                 <w:rFonts w:ascii="Calibri" w:eastAsia="Times New Roman" w:hAnsi="Calibri" w:cs="Calibri"/>
                 <w:color w:val="000000"/>
                 <w:kern w:val="0"/>
-                <w:sz w:val="20"/>
+                <w:sz w:val="19"/>
                 <w:szCs w:val="22"/>
                 <w14:ligatures w14:val="none"/>
               </w:rPr>
@@ -2119,7 +2135,7 @@
                 <w:rFonts w:ascii="Calibri" w:eastAsia="Times New Roman" w:hAnsi="Calibri" w:cs="Calibri"/>
                 <w:color w:val="000000"/>
                 <w:kern w:val="0"/>
-                <w:sz w:val="20"/>
+                <w:sz w:val="19"/>
                 <w:szCs w:val="22"/>
                 <w14:ligatures w14:val="none"/>
               </w:rPr>
@@ -2148,7 +2164,7 @@
                 <w:rFonts w:ascii="Calibri" w:eastAsia="Times New Roman" w:hAnsi="Calibri" w:cs="Calibri"/>
                 <w:color w:val="000000"/>
                 <w:kern w:val="0"/>
-                <w:sz w:val="20"/>
+                <w:sz w:val="19"/>
                 <w:szCs w:val="22"/>
                 <w14:ligatures w14:val="none"/>
               </w:rPr>
@@ -2158,7 +2174,7 @@
                 <w:rFonts w:ascii="Calibri" w:eastAsia="Times New Roman" w:hAnsi="Calibri" w:cs="Calibri"/>
                 <w:color w:val="000000"/>
                 <w:kern w:val="0"/>
-                <w:sz w:val="20"/>
+                <w:sz w:val="19"/>
                 <w:szCs w:val="22"/>
                 <w14:ligatures w14:val="none"/>
               </w:rPr>
@@ -2187,7 +2203,7 @@
                 <w:rFonts w:ascii="Calibri" w:eastAsia="Times New Roman" w:hAnsi="Calibri" w:cs="Calibri"/>
                 <w:color w:val="000000"/>
                 <w:kern w:val="0"/>
-                <w:sz w:val="20"/>
+                <w:sz w:val="19"/>
                 <w:szCs w:val="22"/>
                 <w14:ligatures w14:val="none"/>
               </w:rPr>
@@ -2197,7 +2213,7 @@
                 <w:rFonts w:ascii="Calibri" w:eastAsia="Times New Roman" w:hAnsi="Calibri" w:cs="Calibri"/>
                 <w:color w:val="000000"/>
                 <w:kern w:val="0"/>
-                <w:sz w:val="20"/>
+                <w:sz w:val="19"/>
                 <w:szCs w:val="22"/>
                 <w14:ligatures w14:val="none"/>
               </w:rPr>
@@ -2226,7 +2242,7 @@
                 <w:rFonts w:ascii="Calibri" w:eastAsia="Times New Roman" w:hAnsi="Calibri" w:cs="Calibri"/>
                 <w:color w:val="000000"/>
                 <w:kern w:val="0"/>
-                <w:sz w:val="20"/>
+                <w:sz w:val="19"/>
                 <w:szCs w:val="22"/>
                 <w14:ligatures w14:val="none"/>
               </w:rPr>
@@ -2236,7 +2252,7 @@
                 <w:rFonts w:ascii="Calibri" w:eastAsia="Times New Roman" w:hAnsi="Calibri" w:cs="Calibri"/>
                 <w:color w:val="000000"/>
                 <w:kern w:val="0"/>
-                <w:sz w:val="20"/>
+                <w:sz w:val="19"/>
                 <w:szCs w:val="22"/>
                 <w14:ligatures w14:val="none"/>
               </w:rPr>
@@ -2265,7 +2281,7 @@
                 <w:rFonts w:ascii="Calibri" w:eastAsia="Times New Roman" w:hAnsi="Calibri" w:cs="Calibri"/>
                 <w:color w:val="000000"/>
                 <w:kern w:val="0"/>
-                <w:sz w:val="20"/>
+                <w:sz w:val="19"/>
                 <w:szCs w:val="22"/>
                 <w14:ligatures w14:val="none"/>
               </w:rPr>
@@ -2293,7 +2309,7 @@
                 <w:rFonts w:ascii="Calibri" w:eastAsia="Times New Roman" w:hAnsi="Calibri" w:cs="Calibri"/>
                 <w:color w:val="000000"/>
                 <w:kern w:val="0"/>
-                <w:sz w:val="20"/>
+                <w:sz w:val="19"/>
                 <w:szCs w:val="22"/>
                 <w14:ligatures w14:val="none"/>
               </w:rPr>
@@ -2303,7 +2319,7 @@
                 <w:rFonts w:ascii="Calibri" w:eastAsia="Times New Roman" w:hAnsi="Calibri" w:cs="Calibri"/>
                 <w:color w:val="000000"/>
                 <w:kern w:val="0"/>
-                <w:sz w:val="20"/>
+                <w:sz w:val="19"/>
                 <w:szCs w:val="22"/>
                 <w14:ligatures w14:val="none"/>
               </w:rPr>
@@ -2337,7 +2353,7 @@
                 <w:rFonts w:ascii="Calibri" w:eastAsia="Times New Roman" w:hAnsi="Calibri" w:cs="Calibri"/>
                 <w:color w:val="000000"/>
                 <w:kern w:val="0"/>
-                <w:sz w:val="20"/>
+                <w:sz w:val="19"/>
                 <w:szCs w:val="22"/>
                 <w14:ligatures w14:val="none"/>
               </w:rPr>
@@ -2347,7 +2363,7 @@
                 <w:rFonts w:ascii="Calibri" w:eastAsia="Times New Roman" w:hAnsi="Calibri" w:cs="Calibri"/>
                 <w:color w:val="000000"/>
                 <w:kern w:val="0"/>
-                <w:sz w:val="20"/>
+                <w:sz w:val="19"/>
                 <w:szCs w:val="22"/>
                 <w14:ligatures w14:val="none"/>
               </w:rPr>
@@ -2376,7 +2392,7 @@
                 <w:rFonts w:ascii="Calibri" w:eastAsia="Times New Roman" w:hAnsi="Calibri" w:cs="Calibri"/>
                 <w:color w:val="000000"/>
                 <w:kern w:val="0"/>
-                <w:sz w:val="20"/>
+                <w:sz w:val="19"/>
                 <w:szCs w:val="22"/>
                 <w14:ligatures w14:val="none"/>
               </w:rPr>
@@ -2386,7 +2402,7 @@
                 <w:rFonts w:ascii="Calibri" w:eastAsia="Times New Roman" w:hAnsi="Calibri" w:cs="Calibri"/>
                 <w:color w:val="000000"/>
                 <w:kern w:val="0"/>
-                <w:sz w:val="20"/>
+                <w:sz w:val="19"/>
                 <w:szCs w:val="22"/>
                 <w14:ligatures w14:val="none"/>
               </w:rPr>
@@ -2415,7 +2431,7 @@
                 <w:rFonts w:ascii="Calibri" w:eastAsia="Times New Roman" w:hAnsi="Calibri" w:cs="Calibri"/>
                 <w:color w:val="000000"/>
                 <w:kern w:val="0"/>
-                <w:sz w:val="20"/>
+                <w:sz w:val="19"/>
                 <w:szCs w:val="22"/>
                 <w14:ligatures w14:val="none"/>
               </w:rPr>
@@ -2425,7 +2441,7 @@
                 <w:rFonts w:ascii="Calibri" w:eastAsia="Times New Roman" w:hAnsi="Calibri" w:cs="Calibri"/>
                 <w:color w:val="000000"/>
                 <w:kern w:val="0"/>
-                <w:sz w:val="20"/>
+                <w:sz w:val="19"/>
                 <w:szCs w:val="22"/>
                 <w14:ligatures w14:val="none"/>
               </w:rPr>
@@ -2454,7 +2470,7 @@
                 <w:rFonts w:ascii="Calibri" w:eastAsia="Times New Roman" w:hAnsi="Calibri" w:cs="Calibri"/>
                 <w:color w:val="000000"/>
                 <w:kern w:val="0"/>
-                <w:sz w:val="20"/>
+                <w:sz w:val="19"/>
                 <w:szCs w:val="22"/>
                 <w14:ligatures w14:val="none"/>
               </w:rPr>
@@ -2464,7 +2480,7 @@
                 <w:rFonts w:ascii="Calibri" w:eastAsia="Times New Roman" w:hAnsi="Calibri" w:cs="Calibri"/>
                 <w:color w:val="000000"/>
                 <w:kern w:val="0"/>
-                <w:sz w:val="20"/>
+                <w:sz w:val="19"/>
                 <w:szCs w:val="22"/>
                 <w14:ligatures w14:val="none"/>
               </w:rPr>
@@ -2493,7 +2509,7 @@
                 <w:rFonts w:ascii="Calibri" w:eastAsia="Times New Roman" w:hAnsi="Calibri" w:cs="Calibri"/>
                 <w:color w:val="000000"/>
                 <w:kern w:val="0"/>
-                <w:sz w:val="20"/>
+                <w:sz w:val="19"/>
                 <w:szCs w:val="22"/>
                 <w14:ligatures w14:val="none"/>
               </w:rPr>
@@ -2503,7 +2519,7 @@
                 <w:rFonts w:ascii="Calibri" w:eastAsia="Times New Roman" w:hAnsi="Calibri" w:cs="Calibri"/>
                 <w:color w:val="000000"/>
                 <w:kern w:val="0"/>
-                <w:sz w:val="20"/>
+                <w:sz w:val="19"/>
                 <w:szCs w:val="22"/>
                 <w14:ligatures w14:val="none"/>
               </w:rPr>
@@ -2532,7 +2548,7 @@
                 <w:rFonts w:ascii="Calibri" w:eastAsia="Times New Roman" w:hAnsi="Calibri" w:cs="Calibri"/>
                 <w:color w:val="000000"/>
                 <w:kern w:val="0"/>
-                <w:sz w:val="20"/>
+                <w:sz w:val="19"/>
                 <w:szCs w:val="22"/>
                 <w14:ligatures w14:val="none"/>
               </w:rPr>
@@ -2560,7 +2576,7 @@
                 <w:rFonts w:ascii="Calibri" w:eastAsia="Times New Roman" w:hAnsi="Calibri" w:cs="Calibri"/>
                 <w:color w:val="000000"/>
                 <w:kern w:val="0"/>
-                <w:sz w:val="20"/>
+                <w:sz w:val="19"/>
                 <w:szCs w:val="22"/>
                 <w14:ligatures w14:val="none"/>
               </w:rPr>
@@ -2570,7 +2586,7 @@
                 <w:rFonts w:ascii="Calibri" w:eastAsia="Times New Roman" w:hAnsi="Calibri" w:cs="Calibri"/>
                 <w:color w:val="000000"/>
                 <w:kern w:val="0"/>
-                <w:sz w:val="20"/>
+                <w:sz w:val="19"/>
                 <w:szCs w:val="22"/>
                 <w14:ligatures w14:val="none"/>
               </w:rPr>
@@ -2604,7 +2620,7 @@
                 <w:rFonts w:ascii="Calibri" w:eastAsia="Times New Roman" w:hAnsi="Calibri" w:cs="Calibri"/>
                 <w:color w:val="000000"/>
                 <w:kern w:val="0"/>
-                <w:sz w:val="20"/>
+                <w:sz w:val="19"/>
                 <w:szCs w:val="22"/>
                 <w14:ligatures w14:val="none"/>
               </w:rPr>
@@ -2614,7 +2630,7 @@
                 <w:rFonts w:ascii="Calibri" w:eastAsia="Times New Roman" w:hAnsi="Calibri" w:cs="Calibri"/>
                 <w:color w:val="000000"/>
                 <w:kern w:val="0"/>
-                <w:sz w:val="20"/>
+                <w:sz w:val="19"/>
                 <w:szCs w:val="22"/>
                 <w14:ligatures w14:val="none"/>
               </w:rPr>
@@ -2643,7 +2659,7 @@
                 <w:rFonts w:ascii="Calibri" w:eastAsia="Times New Roman" w:hAnsi="Calibri" w:cs="Calibri"/>
                 <w:color w:val="000000"/>
                 <w:kern w:val="0"/>
-                <w:sz w:val="20"/>
+                <w:sz w:val="19"/>
                 <w:szCs w:val="22"/>
                 <w14:ligatures w14:val="none"/>
               </w:rPr>
@@ -2653,7 +2669,7 @@
                 <w:rFonts w:ascii="Calibri" w:eastAsia="Times New Roman" w:hAnsi="Calibri" w:cs="Calibri"/>
                 <w:color w:val="000000"/>
                 <w:kern w:val="0"/>
-                <w:sz w:val="20"/>
+                <w:sz w:val="19"/>
                 <w:szCs w:val="22"/>
                 <w14:ligatures w14:val="none"/>
               </w:rPr>
@@ -2682,7 +2698,7 @@
                 <w:rFonts w:ascii="Calibri" w:eastAsia="Times New Roman" w:hAnsi="Calibri" w:cs="Calibri"/>
                 <w:color w:val="000000"/>
                 <w:kern w:val="0"/>
-                <w:sz w:val="20"/>
+                <w:sz w:val="19"/>
                 <w:szCs w:val="22"/>
                 <w14:ligatures w14:val="none"/>
               </w:rPr>
@@ -2692,7 +2708,7 @@
                 <w:rFonts w:ascii="Calibri" w:eastAsia="Times New Roman" w:hAnsi="Calibri" w:cs="Calibri"/>
                 <w:color w:val="000000"/>
                 <w:kern w:val="0"/>
-                <w:sz w:val="20"/>
+                <w:sz w:val="19"/>
                 <w:szCs w:val="22"/>
                 <w14:ligatures w14:val="none"/>
               </w:rPr>
@@ -2721,7 +2737,7 @@
                 <w:rFonts w:ascii="Calibri" w:eastAsia="Times New Roman" w:hAnsi="Calibri" w:cs="Calibri"/>
                 <w:color w:val="000000"/>
                 <w:kern w:val="0"/>
-                <w:sz w:val="20"/>
+                <w:sz w:val="19"/>
                 <w:szCs w:val="22"/>
                 <w14:ligatures w14:val="none"/>
               </w:rPr>
@@ -2731,7 +2747,7 @@
                 <w:rFonts w:ascii="Calibri" w:eastAsia="Times New Roman" w:hAnsi="Calibri" w:cs="Calibri"/>
                 <w:color w:val="000000"/>
                 <w:kern w:val="0"/>
-                <w:sz w:val="20"/>
+                <w:sz w:val="19"/>
                 <w:szCs w:val="22"/>
                 <w14:ligatures w14:val="none"/>
               </w:rPr>
@@ -2760,7 +2776,7 @@
                 <w:rFonts w:ascii="Calibri" w:eastAsia="Times New Roman" w:hAnsi="Calibri" w:cs="Calibri"/>
                 <w:color w:val="000000"/>
                 <w:kern w:val="0"/>
-                <w:sz w:val="20"/>
+                <w:sz w:val="19"/>
                 <w:szCs w:val="22"/>
                 <w14:ligatures w14:val="none"/>
               </w:rPr>
@@ -2770,7 +2786,7 @@
                 <w:rFonts w:ascii="Calibri" w:eastAsia="Times New Roman" w:hAnsi="Calibri" w:cs="Calibri"/>
                 <w:color w:val="000000"/>
                 <w:kern w:val="0"/>
-                <w:sz w:val="20"/>
+                <w:sz w:val="19"/>
                 <w:szCs w:val="22"/>
                 <w14:ligatures w14:val="none"/>
               </w:rPr>
@@ -2799,7 +2815,7 @@
                 <w:rFonts w:ascii="Calibri" w:eastAsia="Times New Roman" w:hAnsi="Calibri" w:cs="Calibri"/>
                 <w:color w:val="000000"/>
                 <w:kern w:val="0"/>
-                <w:sz w:val="20"/>
+                <w:sz w:val="19"/>
                 <w:szCs w:val="22"/>
                 <w14:ligatures w14:val="none"/>
               </w:rPr>
@@ -2827,7 +2843,7 @@
                 <w:rFonts w:ascii="Calibri" w:eastAsia="Times New Roman" w:hAnsi="Calibri" w:cs="Calibri"/>
                 <w:color w:val="000000"/>
                 <w:kern w:val="0"/>
-                <w:sz w:val="20"/>
+                <w:sz w:val="19"/>
                 <w:szCs w:val="22"/>
                 <w14:ligatures w14:val="none"/>
               </w:rPr>
@@ -2837,7 +2853,7 @@
                 <w:rFonts w:ascii="Calibri" w:eastAsia="Times New Roman" w:hAnsi="Calibri" w:cs="Calibri"/>
                 <w:color w:val="000000"/>
                 <w:kern w:val="0"/>
-                <w:sz w:val="18"/>
+                <w:sz w:val="17"/>
                 <w:szCs w:val="20"/>
                 <w14:ligatures w14:val="none"/>
               </w:rPr>
@@ -2848,7 +2864,7 @@
                 <w:rFonts w:ascii="Calibri" w:eastAsia="Times New Roman" w:hAnsi="Calibri" w:cs="Calibri"/>
                 <w:color w:val="000000"/>
                 <w:kern w:val="0"/>
-                <w:sz w:val="20"/>
+                <w:sz w:val="19"/>
                 <w:szCs w:val="22"/>
                 <w14:ligatures w14:val="none"/>
               </w:rPr>
@@ -2862,13 +2878,13 @@
       <w:pPr>
         <w:spacing w:after="0" w:line="240" w:lineRule="auto"/>
         <w:rPr>
-          <w:sz w:val="22"/>
+          <w:sz w:val="21"/>
           <w:szCs w:val="22"/>
         </w:rPr>
       </w:pPr>
       <w:r>
         <w:rPr>
-          <w:sz w:val="22"/>
+          <w:sz w:val="21"/>
           <w:szCs w:val="22"/>
         </w:rPr>
         <w:t xml:space="preserve"> </w:t>
@@ -2879,27 +2895,27 @@
         <w:pStyle w:val="Heading2"/>
         <w:spacing w:line="240" w:lineRule="auto"/>
         <w:rPr>
-          <w:sz w:val="29"/>
+          <w:sz w:val="28"/>
           <w:szCs w:val="29"/>
         </w:rPr>
       </w:pPr>
       <w:r>
         <w:rPr>
-          <w:sz w:val="29"/>
+          <w:sz w:val="28"/>
           <w:szCs w:val="29"/>
         </w:rPr>
         <w:t>Addition</w:t>
       </w:r>
       <w:r>
         <w:rPr>
-          <w:sz w:val="29"/>
+          <w:sz w:val="28"/>
           <w:szCs w:val="29"/>
         </w:rPr>
         <w:t>al Required</w:t>
       </w:r>
       <w:r>
         <w:rPr>
-          <w:sz w:val="29"/>
+          <w:sz w:val="28"/>
           <w:szCs w:val="29"/>
         </w:rPr>
         <w:t xml:space="preserve"> Module</w:t>
@@ -2909,27 +2925,27 @@
       <w:pPr>
         <w:spacing w:after="0" w:line="240" w:lineRule="auto"/>
         <w:rPr>
-          <w:sz w:val="22"/>
+          <w:sz w:val="21"/>
           <w:szCs w:val="22"/>
         </w:rPr>
       </w:pPr>
       <w:r>
         <w:rPr>
-          <w:sz w:val="22"/>
+          <w:sz w:val="21"/>
           <w:szCs w:val="22"/>
         </w:rPr>
         <w:t>You will create a</w:t>
       </w:r>
       <w:r>
         <w:rPr>
-          <w:sz w:val="22"/>
+          <w:sz w:val="21"/>
           <w:szCs w:val="22"/>
         </w:rPr>
         <w:t>nother</w:t>
       </w:r>
       <w:r>
         <w:rPr>
-          <w:sz w:val="22"/>
+          <w:sz w:val="21"/>
           <w:szCs w:val="22"/>
         </w:rPr>
         <w:t xml:space="preserve"> module named </w:t>
@@ -2938,14 +2954,14 @@
         <w:rPr>
           <w:b/>
           <w:bCs/>
-          <w:sz w:val="22"/>
+          <w:sz w:val="21"/>
           <w:szCs w:val="22"/>
         </w:rPr>
         <w:t>test_convert_rates.py</w:t>
       </w:r>
       <w:r>
         <w:rPr>
-          <w:sz w:val="22"/>
+          <w:sz w:val="21"/>
           <w:szCs w:val="22"/>
         </w:rPr>
         <w:t xml:space="preserve"> that will provide unit tests for the </w:t>
@@ -2954,28 +2970,28 @@
         <w:rPr>
           <w:b/>
           <w:bCs/>
-          <w:sz w:val="22"/>
+          <w:sz w:val="21"/>
           <w:szCs w:val="22"/>
         </w:rPr>
         <w:t>monthly_to_daily</w:t>
       </w:r>
       <w:r>
         <w:rPr>
-          <w:sz w:val="22"/>
+          <w:sz w:val="21"/>
           <w:szCs w:val="22"/>
         </w:rPr>
         <w:t xml:space="preserve"> function. The test module will have a public function that is invoked from the command line. This public function will invoke a private function</w:t>
       </w:r>
       <w:r>
         <w:rPr>
-          <w:sz w:val="22"/>
+          <w:sz w:val="21"/>
           <w:szCs w:val="22"/>
         </w:rPr>
         <w:t>, multiple times, consisting</w:t>
       </w:r>
       <w:r>
         <w:rPr>
-          <w:sz w:val="22"/>
+          <w:sz w:val="21"/>
           <w:szCs w:val="22"/>
         </w:rPr>
         <w:t xml:space="preserve"> of a series of test values for the </w:t>
@@ -2984,49 +3000,49 @@
         <w:rPr>
           <w:b/>
           <w:bCs/>
-          <w:sz w:val="22"/>
+          <w:sz w:val="21"/>
           <w:szCs w:val="22"/>
         </w:rPr>
         <w:t>monthly_to_daily</w:t>
       </w:r>
       <w:r>
         <w:rPr>
-          <w:sz w:val="22"/>
+          <w:sz w:val="21"/>
           <w:szCs w:val="22"/>
         </w:rPr>
         <w:t xml:space="preserve"> function</w:t>
       </w:r>
       <w:r>
         <w:rPr>
-          <w:sz w:val="22"/>
+          <w:sz w:val="21"/>
           <w:szCs w:val="22"/>
         </w:rPr>
         <w:t xml:space="preserve"> each time</w:t>
       </w:r>
       <w:r>
         <w:rPr>
-          <w:sz w:val="22"/>
+          <w:sz w:val="21"/>
           <w:szCs w:val="22"/>
         </w:rPr>
         <w:t>.</w:t>
       </w:r>
       <w:r>
         <w:rPr>
-          <w:sz w:val="22"/>
+          <w:sz w:val="21"/>
           <w:szCs w:val="22"/>
         </w:rPr>
         <w:t xml:space="preserve"> Each set of test values will validate error inputs, which should raise a</w:t>
       </w:r>
       <w:r>
         <w:rPr>
-          <w:sz w:val="22"/>
+          <w:sz w:val="21"/>
           <w:szCs w:val="22"/>
         </w:rPr>
         <w:t xml:space="preserve"> Python</w:t>
       </w:r>
       <w:r>
         <w:rPr>
-          <w:sz w:val="22"/>
+          <w:sz w:val="21"/>
           <w:szCs w:val="22"/>
         </w:rPr>
         <w:t xml:space="preserve"> </w:t>
@@ -3034,28 +3050,28 @@
       <w:r>
         <w:rPr>
           <w:rFonts w:ascii="Lucida Console" w:hAnsi="Lucida Console"/>
-          <w:sz w:val="18"/>
+          <w:sz w:val="17"/>
           <w:szCs w:val="20"/>
         </w:rPr>
         <w:t>ValueError</w:t>
       </w:r>
       <w:r>
         <w:rPr>
-          <w:sz w:val="22"/>
+          <w:sz w:val="21"/>
           <w:szCs w:val="22"/>
         </w:rPr>
         <w:t xml:space="preserve"> exception, and valid </w:t>
       </w:r>
       <w:r>
         <w:rPr>
-          <w:sz w:val="22"/>
+          <w:sz w:val="21"/>
           <w:szCs w:val="22"/>
         </w:rPr>
         <w:t>outputs.</w:t>
       </w:r>
       <w:r>
         <w:rPr>
-          <w:sz w:val="22"/>
+          <w:sz w:val="21"/>
           <w:szCs w:val="22"/>
         </w:rPr>
         <w:t xml:space="preserve"> Include another private method that uses the excel example above as successful test cases.</w:t>
@@ -3065,7 +3081,7 @@
       <w:pPr>
         <w:spacing w:after="0" w:line="240" w:lineRule="auto"/>
         <w:rPr>
-          <w:sz w:val="22"/>
+          <w:sz w:val="21"/>
           <w:szCs w:val="22"/>
         </w:rPr>
       </w:pPr>
@@ -3074,46 +3090,67 @@
       <w:pPr>
         <w:spacing w:after="0" w:line="240" w:lineRule="auto"/>
         <w:rPr>
-          <w:sz w:val="22"/>
+          <w:sz w:val="21"/>
           <w:szCs w:val="22"/>
         </w:rPr>
       </w:pPr>
       <w:r>
         <w:rPr>
-          <w:sz w:val="22"/>
-          <w:szCs w:val="22"/>
-        </w:rPr>
-        <w:t xml:space="preserve">Produce module docs for both modules and provide docstrings for all generated functions. Add the mathematical solution description above in the module doc for </w:t>
+          <w:sz w:val="21"/>
+          <w:szCs w:val="22"/>
+        </w:rPr>
+        <w:t xml:space="preserve">Produce module docs for both modules and provide docstrings for all generated functions. Add the mathematical solution description </w:t>
+      </w:r>
+      <w:r>
+        <w:rPr>
+          <w:sz w:val="21"/>
+          <w:szCs w:val="22"/>
+        </w:rPr>
+        <w:t xml:space="preserve">taken from </w:t>
+      </w:r>
+      <w:r>
+        <w:rPr>
+          <w:sz w:val="21"/>
+          <w:szCs w:val="22"/>
+        </w:rPr>
+        <w:t xml:space="preserve">above in the module doc for </w:t>
       </w:r>
       <w:r>
         <w:rPr>
           <w:b/>
           <w:bCs/>
-          <w:sz w:val="22"/>
+          <w:sz w:val="21"/>
           <w:szCs w:val="22"/>
         </w:rPr>
         <w:t>test_convert_rates.py</w:t>
       </w:r>
       <w:r>
         <w:rPr>
-          <w:sz w:val="22"/>
+          <w:sz w:val="21"/>
           <w:szCs w:val="22"/>
         </w:rPr>
         <w:t>.</w:t>
+      </w:r>
+      <w:r>
+        <w:rPr>
+          <w:sz w:val="21"/>
+          <w:szCs w:val="22"/>
+        </w:rPr>
+        <w:t xml:space="preserve"> Note changes for increased accuracy</w:t>
       </w:r>
     </w:p>
     <w:p>
       <w:pPr>
         <w:spacing w:after="0" w:line="240" w:lineRule="auto"/>
         <w:rPr>
-          <w:sz w:val="29"/>
+          <w:sz w:val="28"/>
           <w:szCs w:val="32"/>
         </w:rPr>
       </w:pPr>
       <w:r>
         <w:rPr>
           <w:rFonts w:cstheme="minorHAnsi"/>
-          <w:sz w:val="29"/>
+          <w:sz w:val="28"/>
           <w:szCs w:val="32"/>
         </w:rPr>
         <w:t>֎</w:t>

</xml_diff>

<commit_message>
Working version of convert monthly CPI file to daily file
Add convert version using file name constants and printing stats; add pytest for convert support functions.
</commit_message>
<xml_diff>
--- a/PySupport/AdjustedNasdaq/docs/Prompt_CPI_Monthly_to_daily.docx
+++ b/PySupport/AdjustedNasdaq/docs/Prompt_CPI_Monthly_to_daily.docx
@@ -246,7 +246,21 @@
           <w:sz w:val="21"/>
           <w:szCs w:val="22"/>
         </w:rPr>
-        <w:t xml:space="preserve"> is a positive value greater than zero and the return value</w:t>
+        <w:t xml:space="preserve"> is a positive value greater than zero</w:t>
+      </w:r>
+      <w:r>
+        <w:rPr>
+          <w:sz w:val="21"/>
+          <w:szCs w:val="22"/>
+        </w:rPr>
+        <w:t>,</w:t>
+      </w:r>
+      <w:r>
+        <w:rPr>
+          <w:sz w:val="21"/>
+          <w:szCs w:val="22"/>
+        </w:rPr>
+        <w:t xml:space="preserve"> and the return value</w:t>
       </w:r>
       <w:r>
         <w:rPr>

</xml_diff>